<commit_message>
Center-align 부서 and 담당 cells in the 부울경 roster
Co-Authored-By: Claude Opus 5.5 <noreply@anthropic.com>
Claude-Session: https://claude.ai/code/session_01BrkfjrBnqu83xestg1tm1p
</commit_message>
<xml_diff>
--- a/부울경_연합예배_부서.docx
+++ b/부울경_연합예배_부서.docx
@@ -142,7 +142,7 @@
           <w:p>
             <w:pPr>
               <w:spacing w:after="0" w:before="0"/>
-              <w:jc w:val="left"/>
+              <w:jc w:val="center"/>
             </w:pPr>
             <w:r>
               <w:rPr>
@@ -170,7 +170,7 @@
           <w:p>
             <w:pPr>
               <w:spacing w:after="0" w:before="0"/>
-              <w:jc w:val="left"/>
+              <w:jc w:val="center"/>
             </w:pPr>
             <w:r>
               <w:rPr>
@@ -204,7 +204,7 @@
           <w:p>
             <w:pPr>
               <w:spacing w:after="0" w:before="0"/>
-              <w:jc w:val="left"/>
+              <w:jc w:val="center"/>
             </w:pPr>
             <w:r>
               <w:rPr>
@@ -232,7 +232,7 @@
           <w:p>
             <w:pPr>
               <w:spacing w:after="0" w:before="0"/>
-              <w:jc w:val="left"/>
+              <w:jc w:val="center"/>
             </w:pPr>
             <w:r>
               <w:rPr>
@@ -266,7 +266,7 @@
           <w:p>
             <w:pPr>
               <w:spacing w:after="0" w:before="0"/>
-              <w:jc w:val="left"/>
+              <w:jc w:val="center"/>
             </w:pPr>
             <w:r>
               <w:rPr>
@@ -294,7 +294,7 @@
           <w:p>
             <w:pPr>
               <w:spacing w:after="0" w:before="0"/>
-              <w:jc w:val="left"/>
+              <w:jc w:val="center"/>
             </w:pPr>
             <w:r>
               <w:rPr>
@@ -328,7 +328,7 @@
           <w:p>
             <w:pPr>
               <w:spacing w:after="0" w:before="0"/>
-              <w:jc w:val="left"/>
+              <w:jc w:val="center"/>
             </w:pPr>
             <w:r>
               <w:rPr>
@@ -356,7 +356,7 @@
           <w:p>
             <w:pPr>
               <w:spacing w:after="0" w:before="0"/>
-              <w:jc w:val="left"/>
+              <w:jc w:val="center"/>
             </w:pPr>
             <w:r>
               <w:rPr>
@@ -390,7 +390,7 @@
           <w:p>
             <w:pPr>
               <w:spacing w:after="0" w:before="0"/>
-              <w:jc w:val="left"/>
+              <w:jc w:val="center"/>
             </w:pPr>
             <w:r>
               <w:rPr>
@@ -418,7 +418,7 @@
           <w:p>
             <w:pPr>
               <w:spacing w:after="0" w:before="0"/>
-              <w:jc w:val="left"/>
+              <w:jc w:val="center"/>
             </w:pPr>
             <w:r>
               <w:rPr>
@@ -452,7 +452,7 @@
           <w:p>
             <w:pPr>
               <w:spacing w:after="0" w:before="0"/>
-              <w:jc w:val="left"/>
+              <w:jc w:val="center"/>
             </w:pPr>
             <w:r>
               <w:rPr>
@@ -480,7 +480,7 @@
           <w:p>
             <w:pPr>
               <w:spacing w:after="0" w:before="0"/>
-              <w:jc w:val="left"/>
+              <w:jc w:val="center"/>
             </w:pPr>
             <w:r>
               <w:rPr>
@@ -514,7 +514,7 @@
           <w:p>
             <w:pPr>
               <w:spacing w:after="0" w:before="0"/>
-              <w:jc w:val="left"/>
+              <w:jc w:val="center"/>
             </w:pPr>
             <w:r>
               <w:rPr>
@@ -542,7 +542,7 @@
           <w:p>
             <w:pPr>
               <w:spacing w:after="0" w:before="0"/>
-              <w:jc w:val="left"/>
+              <w:jc w:val="center"/>
             </w:pPr>
             <w:r>
               <w:rPr>
@@ -576,7 +576,7 @@
           <w:p>
             <w:pPr>
               <w:spacing w:after="0" w:before="0"/>
-              <w:jc w:val="left"/>
+              <w:jc w:val="center"/>
             </w:pPr>
             <w:r>
               <w:rPr>
@@ -604,7 +604,7 @@
           <w:p>
             <w:pPr>
               <w:spacing w:after="0" w:before="0"/>
-              <w:jc w:val="left"/>
+              <w:jc w:val="center"/>
             </w:pPr>
             <w:r>
               <w:rPr>
@@ -638,7 +638,7 @@
           <w:p>
             <w:pPr>
               <w:spacing w:after="0" w:before="0"/>
-              <w:jc w:val="left"/>
+              <w:jc w:val="center"/>
             </w:pPr>
             <w:r>
               <w:rPr>
@@ -666,7 +666,7 @@
           <w:p>
             <w:pPr>
               <w:spacing w:after="0" w:before="0"/>
-              <w:jc w:val="left"/>
+              <w:jc w:val="center"/>
             </w:pPr>
             <w:r>
               <w:rPr>
@@ -700,7 +700,7 @@
           <w:p>
             <w:pPr>
               <w:spacing w:after="0" w:before="0"/>
-              <w:jc w:val="left"/>
+              <w:jc w:val="center"/>
             </w:pPr>
             <w:r>
               <w:rPr>
@@ -728,7 +728,7 @@
           <w:p>
             <w:pPr>
               <w:spacing w:after="0" w:before="0"/>
-              <w:jc w:val="left"/>
+              <w:jc w:val="center"/>
             </w:pPr>
             <w:r>
               <w:rPr>
@@ -762,7 +762,7 @@
           <w:p>
             <w:pPr>
               <w:spacing w:after="0" w:before="0"/>
-              <w:jc w:val="left"/>
+              <w:jc w:val="center"/>
             </w:pPr>
             <w:r>
               <w:rPr>
@@ -790,7 +790,7 @@
           <w:p>
             <w:pPr>
               <w:spacing w:after="0" w:before="0"/>
-              <w:jc w:val="left"/>
+              <w:jc w:val="center"/>
             </w:pPr>
             <w:r>
               <w:rPr>
@@ -824,7 +824,7 @@
           <w:p>
             <w:pPr>
               <w:spacing w:after="0" w:before="0"/>
-              <w:jc w:val="left"/>
+              <w:jc w:val="center"/>
             </w:pPr>
             <w:r>
               <w:rPr>
@@ -852,7 +852,7 @@
           <w:p>
             <w:pPr>
               <w:spacing w:after="0" w:before="0"/>
-              <w:jc w:val="left"/>
+              <w:jc w:val="center"/>
             </w:pPr>
             <w:r>
               <w:rPr>
@@ -886,7 +886,7 @@
           <w:p>
             <w:pPr>
               <w:spacing w:after="0" w:before="0"/>
-              <w:jc w:val="left"/>
+              <w:jc w:val="center"/>
             </w:pPr>
             <w:r>
               <w:rPr>
@@ -914,7 +914,7 @@
           <w:p>
             <w:pPr>
               <w:spacing w:after="0" w:before="0"/>
-              <w:jc w:val="left"/>
+              <w:jc w:val="center"/>
             </w:pPr>
             <w:r>
               <w:rPr>
@@ -948,7 +948,7 @@
           <w:p>
             <w:pPr>
               <w:spacing w:after="0" w:before="0"/>
-              <w:jc w:val="left"/>
+              <w:jc w:val="center"/>
             </w:pPr>
             <w:r>
               <w:rPr>
@@ -976,7 +976,7 @@
           <w:p>
             <w:pPr>
               <w:spacing w:after="0" w:before="0"/>
-              <w:jc w:val="left"/>
+              <w:jc w:val="center"/>
             </w:pPr>
             <w:r>
               <w:rPr>

</xml_diff>

<commit_message>
Remove the lines under the title and date rows in the 부울경 roster
The title, date and venue now read as one header block; the line below
the venue row and the outer border are kept. All text stays in 맑은 고딕.

Co-Authored-By: Claude Opus 5.5 <noreply@anthropic.com>
Claude-Session: https://claude.ai/code/session_01BrkfjrBnqu83xestg1tm1p
</commit_message>
<xml_diff>
--- a/부울경_연합예배_부서.docx
+++ b/부울경_연합예배_부서.docx
@@ -27,6 +27,12 @@
           <w:tcPr>
             <w:tcW w:type="dxa" w:w="9306"/>
             <w:gridSpan w:val="2"/>
+            <w:tcBorders>
+              <w:top w:val="single" w:color="000000" w:sz="8"/>
+              <w:left w:val="single" w:color="000000" w:sz="8"/>
+              <w:bottom w:val="none" w:color="FFFFFF" w:sz="0"/>
+              <w:right w:val="single" w:color="000000" w:sz="8"/>
+            </w:tcBorders>
             <w:tcMar>
               <w:top w:type="dxa" w:w="40"/>
               <w:left w:type="dxa" w:w="200"/>
@@ -62,6 +68,12 @@
           <w:tcPr>
             <w:tcW w:type="dxa" w:w="9306"/>
             <w:gridSpan w:val="2"/>
+            <w:tcBorders>
+              <w:top w:val="none" w:color="FFFFFF" w:sz="0"/>
+              <w:left w:val="single" w:color="000000" w:sz="8"/>
+              <w:bottom w:val="none" w:color="FFFFFF" w:sz="0"/>
+              <w:right w:val="single" w:color="000000" w:sz="8"/>
+            </w:tcBorders>
             <w:tcMar>
               <w:top w:type="dxa" w:w="40"/>
               <w:left w:type="dxa" w:w="200"/>
@@ -97,6 +109,12 @@
           <w:tcPr>
             <w:tcW w:type="dxa" w:w="9306"/>
             <w:gridSpan w:val="2"/>
+            <w:tcBorders>
+              <w:top w:val="none" w:color="FFFFFF" w:sz="0"/>
+              <w:left w:val="single" w:color="000000" w:sz="8"/>
+              <w:bottom w:val="single" w:color="000000" w:sz="8"/>
+              <w:right w:val="single" w:color="000000" w:sz="8"/>
+            </w:tcBorders>
             <w:tcMar>
               <w:top w:type="dxa" w:w="40"/>
               <w:left w:type="dxa" w:w="200"/>

</xml_diff>

<commit_message>
Drop the remaining borders around the 부울경 roster header
The title, date and venue now sit above the table with no box; only the
line under the venue row (the top of the table) remains. The date and
venue are right-aligned flush with the table edge.

Co-Authored-By: Claude Opus 5.5 <noreply@anthropic.com>
Claude-Session: https://claude.ai/code/session_01BrkfjrBnqu83xestg1tm1p
</commit_message>
<xml_diff>
--- a/부울경_연합예배_부서.docx
+++ b/부울경_연합예배_부서.docx
@@ -28,10 +28,10 @@
             <w:tcW w:type="dxa" w:w="9306"/>
             <w:gridSpan w:val="2"/>
             <w:tcBorders>
-              <w:top w:val="single" w:color="000000" w:sz="8"/>
-              <w:left w:val="single" w:color="000000" w:sz="8"/>
+              <w:top w:val="none" w:color="FFFFFF" w:sz="0"/>
+              <w:left w:val="none" w:color="FFFFFF" w:sz="0"/>
               <w:bottom w:val="none" w:color="FFFFFF" w:sz="0"/>
-              <w:right w:val="single" w:color="000000" w:sz="8"/>
+              <w:right w:val="none" w:color="FFFFFF" w:sz="0"/>
             </w:tcBorders>
             <w:tcMar>
               <w:top w:type="dxa" w:w="40"/>
@@ -70,15 +70,15 @@
             <w:gridSpan w:val="2"/>
             <w:tcBorders>
               <w:top w:val="none" w:color="FFFFFF" w:sz="0"/>
-              <w:left w:val="single" w:color="000000" w:sz="8"/>
+              <w:left w:val="none" w:color="FFFFFF" w:sz="0"/>
               <w:bottom w:val="none" w:color="FFFFFF" w:sz="0"/>
-              <w:right w:val="single" w:color="000000" w:sz="8"/>
+              <w:right w:val="none" w:color="FFFFFF" w:sz="0"/>
             </w:tcBorders>
             <w:tcMar>
               <w:top w:type="dxa" w:w="40"/>
               <w:left w:type="dxa" w:w="200"/>
               <w:bottom w:type="dxa" w:w="40"/>
-              <w:right w:type="dxa" w:w="200"/>
+              <w:right w:type="dxa" w:w="0"/>
             </w:tcMar>
             <w:vAlign w:val="center"/>
           </w:tcPr>
@@ -111,15 +111,15 @@
             <w:gridSpan w:val="2"/>
             <w:tcBorders>
               <w:top w:val="none" w:color="FFFFFF" w:sz="0"/>
-              <w:left w:val="single" w:color="000000" w:sz="8"/>
+              <w:left w:val="none" w:color="FFFFFF" w:sz="0"/>
               <w:bottom w:val="single" w:color="000000" w:sz="8"/>
-              <w:right w:val="single" w:color="000000" w:sz="8"/>
+              <w:right w:val="none" w:color="FFFFFF" w:sz="0"/>
             </w:tcBorders>
             <w:tcMar>
               <w:top w:type="dxa" w:w="40"/>
               <w:left w:type="dxa" w:w="200"/>
               <w:bottom w:type="dxa" w:w="40"/>
-              <w:right w:type="dxa" w:w="200"/>
+              <w:right w:type="dxa" w:w="0"/>
             </w:tcMar>
             <w:vAlign w:val="center"/>
           </w:tcPr>

</xml_diff>

<commit_message>
Thicken the roster's outer border, shade 부서 cells, add a 부서/담당자 row
- Outer border of the table is now 2.25pt; inner lines stay 1pt.
- The 부서 column is filled light sky blue (DDEBF7).
- A new first row labels the columns 부서 and 담당자 above 진행/김영교.
- Data rows are slightly shorter so the page still fits on one A4 sheet.

Co-Authored-By: Claude Opus 5.5 <noreply@anthropic.com>
Claude-Session: https://claude.ai/code/session_01BrkfjrBnqu83xestg1tm1p
</commit_message>
<xml_diff>
--- a/부울경_연합예배_부서.docx
+++ b/부울경_연합예배_부서.docx
@@ -6,10 +6,10 @@
       <w:tblPr>
         <w:tblW w:type="dxa" w:w="9306"/>
         <w:tblBorders>
-          <w:top w:val="single" w:color="000000" w:sz="8"/>
-          <w:left w:val="single" w:color="000000" w:sz="8"/>
-          <w:bottom w:val="single" w:color="000000" w:sz="8"/>
-          <w:right w:val="single" w:color="000000" w:sz="8"/>
+          <w:top w:val="single" w:color="000000" w:sz="18"/>
+          <w:left w:val="single" w:color="000000" w:sz="18"/>
+          <w:bottom w:val="single" w:color="000000" w:sz="18"/>
+          <w:right w:val="single" w:color="000000" w:sz="18"/>
           <w:insideH w:val="single" w:color="000000" w:sz="8"/>
           <w:insideV w:val="single" w:color="000000" w:sz="8"/>
         </w:tblBorders>
@@ -112,7 +112,7 @@
             <w:tcBorders>
               <w:top w:val="none" w:color="FFFFFF" w:sz="0"/>
               <w:left w:val="none" w:color="FFFFFF" w:sz="0"/>
-              <w:bottom w:val="single" w:color="000000" w:sz="8"/>
+              <w:bottom w:val="single" w:color="000000" w:sz="18"/>
               <w:right w:val="none" w:color="FFFFFF" w:sz="0"/>
             </w:tcBorders>
             <w:tcMar>
@@ -144,11 +144,87 @@
       <w:tr>
         <w:trPr>
           <w:cantSplit/>
-          <w:trHeight w:val="870" w:hRule="atLeast"/>
+          <w:trHeight w:val="820" w:hRule="atLeast"/>
         </w:trPr>
         <w:tc>
           <w:tcPr>
             <w:tcW w:type="dxa" w:w="3000"/>
+            <w:tcBorders>
+              <w:top w:val="single" w:color="000000" w:sz="18"/>
+              <w:left w:val="single" w:color="000000" w:sz="18"/>
+              <w:bottom w:val="single" w:color="000000" w:sz="8"/>
+              <w:right w:val="single" w:color="000000" w:sz="8"/>
+            </w:tcBorders>
+            <w:shd w:fill="DDEBF7" w:color="auto" w:val="clear"/>
+            <w:tcMar>
+              <w:top w:type="dxa" w:w="40"/>
+              <w:left w:type="dxa" w:w="200"/>
+              <w:bottom w:type="dxa" w:w="40"/>
+              <w:right w:type="dxa" w:w="200"/>
+            </w:tcMar>
+            <w:vAlign w:val="center"/>
+          </w:tcPr>
+          <w:p>
+            <w:pPr>
+              <w:spacing w:after="0" w:before="0"/>
+              <w:jc w:val="center"/>
+            </w:pPr>
+            <w:r>
+              <w:rPr>
+                <w:rFonts w:ascii="맑은 고딕" w:cs="맑은 고딕" w:eastAsia="맑은 고딕" w:hAnsi="맑은 고딕"/>
+                <w:b w:val="false"/>
+                <w:bCs w:val="false"/>
+                <w:sz w:val="32"/>
+                <w:szCs w:val="32"/>
+              </w:rPr>
+              <w:t xml:space="preserve">부서</w:t>
+            </w:r>
+          </w:p>
+        </w:tc>
+        <w:tc>
+          <w:tcPr>
+            <w:tcW w:type="dxa" w:w="6306"/>
+            <w:tcBorders>
+              <w:top w:val="single" w:color="000000" w:sz="18"/>
+              <w:left w:val="single" w:color="000000" w:sz="8"/>
+              <w:bottom w:val="single" w:color="000000" w:sz="8"/>
+              <w:right w:val="single" w:color="000000" w:sz="18"/>
+            </w:tcBorders>
+            <w:tcMar>
+              <w:top w:type="dxa" w:w="40"/>
+              <w:left w:type="dxa" w:w="200"/>
+              <w:bottom w:type="dxa" w:w="40"/>
+              <w:right w:type="dxa" w:w="200"/>
+            </w:tcMar>
+            <w:vAlign w:val="center"/>
+          </w:tcPr>
+          <w:p>
+            <w:pPr>
+              <w:spacing w:after="0" w:before="0"/>
+              <w:jc w:val="center"/>
+            </w:pPr>
+            <w:r>
+              <w:rPr>
+                <w:rFonts w:ascii="맑은 고딕" w:cs="맑은 고딕" w:eastAsia="맑은 고딕" w:hAnsi="맑은 고딕"/>
+                <w:b w:val="false"/>
+                <w:bCs w:val="false"/>
+                <w:sz w:val="32"/>
+                <w:szCs w:val="32"/>
+              </w:rPr>
+              <w:t xml:space="preserve">담당자</w:t>
+            </w:r>
+          </w:p>
+        </w:tc>
+      </w:tr>
+      <w:tr>
+        <w:trPr>
+          <w:cantSplit/>
+          <w:trHeight w:val="820" w:hRule="atLeast"/>
+        </w:trPr>
+        <w:tc>
+          <w:tcPr>
+            <w:tcW w:type="dxa" w:w="3000"/>
+            <w:shd w:fill="DDEBF7" w:color="auto" w:val="clear"/>
             <w:tcMar>
               <w:top w:type="dxa" w:w="40"/>
               <w:left w:type="dxa" w:w="200"/>
@@ -206,11 +282,12 @@
       <w:tr>
         <w:trPr>
           <w:cantSplit/>
-          <w:trHeight w:val="870" w:hRule="atLeast"/>
+          <w:trHeight w:val="820" w:hRule="atLeast"/>
         </w:trPr>
         <w:tc>
           <w:tcPr>
             <w:tcW w:type="dxa" w:w="3000"/>
+            <w:shd w:fill="DDEBF7" w:color="auto" w:val="clear"/>
             <w:tcMar>
               <w:top w:type="dxa" w:w="40"/>
               <w:left w:type="dxa" w:w="200"/>
@@ -268,11 +345,12 @@
       <w:tr>
         <w:trPr>
           <w:cantSplit/>
-          <w:trHeight w:val="870" w:hRule="atLeast"/>
+          <w:trHeight w:val="820" w:hRule="atLeast"/>
         </w:trPr>
         <w:tc>
           <w:tcPr>
             <w:tcW w:type="dxa" w:w="3000"/>
+            <w:shd w:fill="DDEBF7" w:color="auto" w:val="clear"/>
             <w:tcMar>
               <w:top w:type="dxa" w:w="40"/>
               <w:left w:type="dxa" w:w="200"/>
@@ -330,11 +408,12 @@
       <w:tr>
         <w:trPr>
           <w:cantSplit/>
-          <w:trHeight w:val="870" w:hRule="atLeast"/>
+          <w:trHeight w:val="820" w:hRule="atLeast"/>
         </w:trPr>
         <w:tc>
           <w:tcPr>
             <w:tcW w:type="dxa" w:w="3000"/>
+            <w:shd w:fill="DDEBF7" w:color="auto" w:val="clear"/>
             <w:tcMar>
               <w:top w:type="dxa" w:w="40"/>
               <w:left w:type="dxa" w:w="200"/>
@@ -392,11 +471,12 @@
       <w:tr>
         <w:trPr>
           <w:cantSplit/>
-          <w:trHeight w:val="870" w:hRule="atLeast"/>
+          <w:trHeight w:val="820" w:hRule="atLeast"/>
         </w:trPr>
         <w:tc>
           <w:tcPr>
             <w:tcW w:type="dxa" w:w="3000"/>
+            <w:shd w:fill="DDEBF7" w:color="auto" w:val="clear"/>
             <w:tcMar>
               <w:top w:type="dxa" w:w="40"/>
               <w:left w:type="dxa" w:w="200"/>
@@ -454,11 +534,12 @@
       <w:tr>
         <w:trPr>
           <w:cantSplit/>
-          <w:trHeight w:val="870" w:hRule="atLeast"/>
+          <w:trHeight w:val="820" w:hRule="atLeast"/>
         </w:trPr>
         <w:tc>
           <w:tcPr>
             <w:tcW w:type="dxa" w:w="3000"/>
+            <w:shd w:fill="DDEBF7" w:color="auto" w:val="clear"/>
             <w:tcMar>
               <w:top w:type="dxa" w:w="40"/>
               <w:left w:type="dxa" w:w="200"/>
@@ -516,11 +597,12 @@
       <w:tr>
         <w:trPr>
           <w:cantSplit/>
-          <w:trHeight w:val="870" w:hRule="atLeast"/>
+          <w:trHeight w:val="820" w:hRule="atLeast"/>
         </w:trPr>
         <w:tc>
           <w:tcPr>
             <w:tcW w:type="dxa" w:w="3000"/>
+            <w:shd w:fill="DDEBF7" w:color="auto" w:val="clear"/>
             <w:tcMar>
               <w:top w:type="dxa" w:w="40"/>
               <w:left w:type="dxa" w:w="200"/>
@@ -578,11 +660,12 @@
       <w:tr>
         <w:trPr>
           <w:cantSplit/>
-          <w:trHeight w:val="870" w:hRule="atLeast"/>
+          <w:trHeight w:val="820" w:hRule="atLeast"/>
         </w:trPr>
         <w:tc>
           <w:tcPr>
             <w:tcW w:type="dxa" w:w="3000"/>
+            <w:shd w:fill="DDEBF7" w:color="auto" w:val="clear"/>
             <w:tcMar>
               <w:top w:type="dxa" w:w="40"/>
               <w:left w:type="dxa" w:w="200"/>
@@ -640,11 +723,12 @@
       <w:tr>
         <w:trPr>
           <w:cantSplit/>
-          <w:trHeight w:val="870" w:hRule="atLeast"/>
+          <w:trHeight w:val="820" w:hRule="atLeast"/>
         </w:trPr>
         <w:tc>
           <w:tcPr>
             <w:tcW w:type="dxa" w:w="3000"/>
+            <w:shd w:fill="DDEBF7" w:color="auto" w:val="clear"/>
             <w:tcMar>
               <w:top w:type="dxa" w:w="40"/>
               <w:left w:type="dxa" w:w="200"/>
@@ -702,11 +786,12 @@
       <w:tr>
         <w:trPr>
           <w:cantSplit/>
-          <w:trHeight w:val="870" w:hRule="atLeast"/>
+          <w:trHeight w:val="820" w:hRule="atLeast"/>
         </w:trPr>
         <w:tc>
           <w:tcPr>
             <w:tcW w:type="dxa" w:w="3000"/>
+            <w:shd w:fill="DDEBF7" w:color="auto" w:val="clear"/>
             <w:tcMar>
               <w:top w:type="dxa" w:w="40"/>
               <w:left w:type="dxa" w:w="200"/>
@@ -764,11 +849,12 @@
       <w:tr>
         <w:trPr>
           <w:cantSplit/>
-          <w:trHeight w:val="870" w:hRule="atLeast"/>
+          <w:trHeight w:val="820" w:hRule="atLeast"/>
         </w:trPr>
         <w:tc>
           <w:tcPr>
             <w:tcW w:type="dxa" w:w="3000"/>
+            <w:shd w:fill="DDEBF7" w:color="auto" w:val="clear"/>
             <w:tcMar>
               <w:top w:type="dxa" w:w="40"/>
               <w:left w:type="dxa" w:w="200"/>
@@ -826,11 +912,12 @@
       <w:tr>
         <w:trPr>
           <w:cantSplit/>
-          <w:trHeight w:val="870" w:hRule="atLeast"/>
+          <w:trHeight w:val="820" w:hRule="atLeast"/>
         </w:trPr>
         <w:tc>
           <w:tcPr>
             <w:tcW w:type="dxa" w:w="3000"/>
+            <w:shd w:fill="DDEBF7" w:color="auto" w:val="clear"/>
             <w:tcMar>
               <w:top w:type="dxa" w:w="40"/>
               <w:left w:type="dxa" w:w="200"/>
@@ -888,11 +975,12 @@
       <w:tr>
         <w:trPr>
           <w:cantSplit/>
-          <w:trHeight w:val="870" w:hRule="atLeast"/>
+          <w:trHeight w:val="820" w:hRule="atLeast"/>
         </w:trPr>
         <w:tc>
           <w:tcPr>
             <w:tcW w:type="dxa" w:w="3000"/>
+            <w:shd w:fill="DDEBF7" w:color="auto" w:val="clear"/>
             <w:tcMar>
               <w:top w:type="dxa" w:w="40"/>
               <w:left w:type="dxa" w:w="200"/>
@@ -950,11 +1038,12 @@
       <w:tr>
         <w:trPr>
           <w:cantSplit/>
-          <w:trHeight w:val="870" w:hRule="atLeast"/>
+          <w:trHeight w:val="820" w:hRule="atLeast"/>
         </w:trPr>
         <w:tc>
           <w:tcPr>
             <w:tcW w:type="dxa" w:w="3000"/>
+            <w:shd w:fill="DDEBF7" w:color="auto" w:val="clear"/>
             <w:tcMar>
               <w:top w:type="dxa" w:w="40"/>
               <w:left w:type="dxa" w:w="200"/>

</xml_diff>

<commit_message>
Shade only the 부서/담당자 header row in the roster
The 부서 column cells go back to white; the light sky blue fill is now on
the header row only, across both columns.

Co-Authored-By: Claude Opus 5.5 <noreply@anthropic.com>
Claude-Session: https://claude.ai/code/session_01BrkfjrBnqu83xestg1tm1p
</commit_message>
<xml_diff>
--- a/부울경_연합예배_부서.docx
+++ b/부울경_연합예배_부서.docx
@@ -190,6 +190,7 @@
               <w:bottom w:val="single" w:color="000000" w:sz="8"/>
               <w:right w:val="single" w:color="000000" w:sz="18"/>
             </w:tcBorders>
+            <w:shd w:fill="DDEBF7" w:color="auto" w:val="clear"/>
             <w:tcMar>
               <w:top w:type="dxa" w:w="40"/>
               <w:left w:type="dxa" w:w="200"/>
@@ -224,7 +225,6 @@
         <w:tc>
           <w:tcPr>
             <w:tcW w:type="dxa" w:w="3000"/>
-            <w:shd w:fill="DDEBF7" w:color="auto" w:val="clear"/>
             <w:tcMar>
               <w:top w:type="dxa" w:w="40"/>
               <w:left w:type="dxa" w:w="200"/>
@@ -287,7 +287,6 @@
         <w:tc>
           <w:tcPr>
             <w:tcW w:type="dxa" w:w="3000"/>
-            <w:shd w:fill="DDEBF7" w:color="auto" w:val="clear"/>
             <w:tcMar>
               <w:top w:type="dxa" w:w="40"/>
               <w:left w:type="dxa" w:w="200"/>
@@ -350,7 +349,6 @@
         <w:tc>
           <w:tcPr>
             <w:tcW w:type="dxa" w:w="3000"/>
-            <w:shd w:fill="DDEBF7" w:color="auto" w:val="clear"/>
             <w:tcMar>
               <w:top w:type="dxa" w:w="40"/>
               <w:left w:type="dxa" w:w="200"/>
@@ -413,7 +411,6 @@
         <w:tc>
           <w:tcPr>
             <w:tcW w:type="dxa" w:w="3000"/>
-            <w:shd w:fill="DDEBF7" w:color="auto" w:val="clear"/>
             <w:tcMar>
               <w:top w:type="dxa" w:w="40"/>
               <w:left w:type="dxa" w:w="200"/>
@@ -476,7 +473,6 @@
         <w:tc>
           <w:tcPr>
             <w:tcW w:type="dxa" w:w="3000"/>
-            <w:shd w:fill="DDEBF7" w:color="auto" w:val="clear"/>
             <w:tcMar>
               <w:top w:type="dxa" w:w="40"/>
               <w:left w:type="dxa" w:w="200"/>
@@ -539,7 +535,6 @@
         <w:tc>
           <w:tcPr>
             <w:tcW w:type="dxa" w:w="3000"/>
-            <w:shd w:fill="DDEBF7" w:color="auto" w:val="clear"/>
             <w:tcMar>
               <w:top w:type="dxa" w:w="40"/>
               <w:left w:type="dxa" w:w="200"/>
@@ -602,7 +597,6 @@
         <w:tc>
           <w:tcPr>
             <w:tcW w:type="dxa" w:w="3000"/>
-            <w:shd w:fill="DDEBF7" w:color="auto" w:val="clear"/>
             <w:tcMar>
               <w:top w:type="dxa" w:w="40"/>
               <w:left w:type="dxa" w:w="200"/>
@@ -665,7 +659,6 @@
         <w:tc>
           <w:tcPr>
             <w:tcW w:type="dxa" w:w="3000"/>
-            <w:shd w:fill="DDEBF7" w:color="auto" w:val="clear"/>
             <w:tcMar>
               <w:top w:type="dxa" w:w="40"/>
               <w:left w:type="dxa" w:w="200"/>
@@ -728,7 +721,6 @@
         <w:tc>
           <w:tcPr>
             <w:tcW w:type="dxa" w:w="3000"/>
-            <w:shd w:fill="DDEBF7" w:color="auto" w:val="clear"/>
             <w:tcMar>
               <w:top w:type="dxa" w:w="40"/>
               <w:left w:type="dxa" w:w="200"/>
@@ -791,7 +783,6 @@
         <w:tc>
           <w:tcPr>
             <w:tcW w:type="dxa" w:w="3000"/>
-            <w:shd w:fill="DDEBF7" w:color="auto" w:val="clear"/>
             <w:tcMar>
               <w:top w:type="dxa" w:w="40"/>
               <w:left w:type="dxa" w:w="200"/>
@@ -854,7 +845,6 @@
         <w:tc>
           <w:tcPr>
             <w:tcW w:type="dxa" w:w="3000"/>
-            <w:shd w:fill="DDEBF7" w:color="auto" w:val="clear"/>
             <w:tcMar>
               <w:top w:type="dxa" w:w="40"/>
               <w:left w:type="dxa" w:w="200"/>
@@ -917,7 +907,6 @@
         <w:tc>
           <w:tcPr>
             <w:tcW w:type="dxa" w:w="3000"/>
-            <w:shd w:fill="DDEBF7" w:color="auto" w:val="clear"/>
             <w:tcMar>
               <w:top w:type="dxa" w:w="40"/>
               <w:left w:type="dxa" w:w="200"/>
@@ -980,7 +969,6 @@
         <w:tc>
           <w:tcPr>
             <w:tcW w:type="dxa" w:w="3000"/>
-            <w:shd w:fill="DDEBF7" w:color="auto" w:val="clear"/>
             <w:tcMar>
               <w:top w:type="dxa" w:w="40"/>
               <w:left w:type="dxa" w:w="200"/>
@@ -1043,7 +1031,6 @@
         <w:tc>
           <w:tcPr>
             <w:tcW w:type="dxa" w:w="3000"/>
-            <w:shd w:fill="DDEBF7" w:color="auto" w:val="clear"/>
             <w:tcMar>
               <w:top w:type="dxa" w:w="40"/>
               <w:left w:type="dxa" w:w="200"/>

</xml_diff>

<commit_message>
Keep the 부울경 roster on one printed page in Word
Word adds a paragraph after a table that ends the document. At the
default 16pt it needed more room than was left on the page, so Word
would push it onto a blank second page. Add that paragraph explicitly at
an exact 1pt line height, and trim the table rows from 820 to 800 twips
so about 0.55cm of spare height absorbs any font or border differences.

Co-Authored-By: Claude Opus 5.5 <noreply@anthropic.com>
Claude-Session: https://claude.ai/code/session_01BrkfjrBnqu83xestg1tm1p
</commit_message>
<xml_diff>
--- a/부울경_연합예배_부서.docx
+++ b/부울경_연합예배_부서.docx
@@ -144,7 +144,7 @@
       <w:tr>
         <w:trPr>
           <w:cantSplit/>
-          <w:trHeight w:val="820" w:hRule="atLeast"/>
+          <w:trHeight w:val="800" w:hRule="atLeast"/>
         </w:trPr>
         <w:tc>
           <w:tcPr>
@@ -220,7 +220,7 @@
       <w:tr>
         <w:trPr>
           <w:cantSplit/>
-          <w:trHeight w:val="820" w:hRule="atLeast"/>
+          <w:trHeight w:val="800" w:hRule="atLeast"/>
         </w:trPr>
         <w:tc>
           <w:tcPr>
@@ -282,7 +282,7 @@
       <w:tr>
         <w:trPr>
           <w:cantSplit/>
-          <w:trHeight w:val="820" w:hRule="atLeast"/>
+          <w:trHeight w:val="800" w:hRule="atLeast"/>
         </w:trPr>
         <w:tc>
           <w:tcPr>
@@ -344,7 +344,7 @@
       <w:tr>
         <w:trPr>
           <w:cantSplit/>
-          <w:trHeight w:val="820" w:hRule="atLeast"/>
+          <w:trHeight w:val="800" w:hRule="atLeast"/>
         </w:trPr>
         <w:tc>
           <w:tcPr>
@@ -406,7 +406,7 @@
       <w:tr>
         <w:trPr>
           <w:cantSplit/>
-          <w:trHeight w:val="820" w:hRule="atLeast"/>
+          <w:trHeight w:val="800" w:hRule="atLeast"/>
         </w:trPr>
         <w:tc>
           <w:tcPr>
@@ -468,7 +468,7 @@
       <w:tr>
         <w:trPr>
           <w:cantSplit/>
-          <w:trHeight w:val="820" w:hRule="atLeast"/>
+          <w:trHeight w:val="800" w:hRule="atLeast"/>
         </w:trPr>
         <w:tc>
           <w:tcPr>
@@ -530,7 +530,7 @@
       <w:tr>
         <w:trPr>
           <w:cantSplit/>
-          <w:trHeight w:val="820" w:hRule="atLeast"/>
+          <w:trHeight w:val="800" w:hRule="atLeast"/>
         </w:trPr>
         <w:tc>
           <w:tcPr>
@@ -592,7 +592,7 @@
       <w:tr>
         <w:trPr>
           <w:cantSplit/>
-          <w:trHeight w:val="820" w:hRule="atLeast"/>
+          <w:trHeight w:val="800" w:hRule="atLeast"/>
         </w:trPr>
         <w:tc>
           <w:tcPr>
@@ -654,7 +654,7 @@
       <w:tr>
         <w:trPr>
           <w:cantSplit/>
-          <w:trHeight w:val="820" w:hRule="atLeast"/>
+          <w:trHeight w:val="800" w:hRule="atLeast"/>
         </w:trPr>
         <w:tc>
           <w:tcPr>
@@ -716,7 +716,7 @@
       <w:tr>
         <w:trPr>
           <w:cantSplit/>
-          <w:trHeight w:val="820" w:hRule="atLeast"/>
+          <w:trHeight w:val="800" w:hRule="atLeast"/>
         </w:trPr>
         <w:tc>
           <w:tcPr>
@@ -778,7 +778,7 @@
       <w:tr>
         <w:trPr>
           <w:cantSplit/>
-          <w:trHeight w:val="820" w:hRule="atLeast"/>
+          <w:trHeight w:val="800" w:hRule="atLeast"/>
         </w:trPr>
         <w:tc>
           <w:tcPr>
@@ -840,7 +840,7 @@
       <w:tr>
         <w:trPr>
           <w:cantSplit/>
-          <w:trHeight w:val="820" w:hRule="atLeast"/>
+          <w:trHeight w:val="800" w:hRule="atLeast"/>
         </w:trPr>
         <w:tc>
           <w:tcPr>
@@ -902,7 +902,7 @@
       <w:tr>
         <w:trPr>
           <w:cantSplit/>
-          <w:trHeight w:val="820" w:hRule="atLeast"/>
+          <w:trHeight w:val="800" w:hRule="atLeast"/>
         </w:trPr>
         <w:tc>
           <w:tcPr>
@@ -964,7 +964,7 @@
       <w:tr>
         <w:trPr>
           <w:cantSplit/>
-          <w:trHeight w:val="820" w:hRule="atLeast"/>
+          <w:trHeight w:val="800" w:hRule="atLeast"/>
         </w:trPr>
         <w:tc>
           <w:tcPr>
@@ -1026,7 +1026,7 @@
       <w:tr>
         <w:trPr>
           <w:cantSplit/>
-          <w:trHeight w:val="820" w:hRule="atLeast"/>
+          <w:trHeight w:val="800" w:hRule="atLeast"/>
         </w:trPr>
         <w:tc>
           <w:tcPr>
@@ -1086,6 +1086,18 @@
         </w:tc>
       </w:tr>
     </w:tbl>
+    <w:p>
+      <w:pPr>
+        <w:spacing w:after="0" w:before="0" w:line="20" w:lineRule="exact"/>
+      </w:pPr>
+      <w:r>
+        <w:rPr>
+          <w:sz w:val="2"/>
+          <w:szCs w:val="2"/>
+        </w:rPr>
+        <w:t xml:space="preserve"/>
+      </w:r>
+    </w:p>
     <w:sectPr>
       <w:pgSz w:w="11906" w:h="16838" w:orient="portrait"/>
       <w:pgMar w:top="1100" w:right="1300" w:bottom="1000" w:left="1300" w:header="708" w:footer="708" w:gutter="0"/>

</xml_diff>